<commit_message>
Party Picker 1.0.0: Alan's edits to the Nexus description
From "Alan edits NexusMods_Description_v1.0.0.md" (2026-10-22), carried into
the BBCode, the README (download and GitHub front page) and the Markdown copy:
- new lead line "Why this Mod: To choose the number and identity of your
  party members without spells, dialogues or using hotbar space."; the
  summary below it is no longer bold
- screenshot TODO and the rules before it and before Features removed
- Compatibility: "Other Party Limit Mods: Could lead to odd results; use at
  your own risk."
- Known limitations: "This bug is according to Party Limit Begone's notes."
Markup slips fixed: "hotbnar", stray asterisks, comma before "This bug".
Word/PDF, bundle, zip and release-notes hashes rebuilt.
</commit_message>
<xml_diff>
--- a/dist_docs/README.docx
+++ b/dist_docs/README.docx
@@ -15,6 +15,12 @@
         <w:rPr>
           <w:b/>
         </w:rPr>
+        <w:t>Why this Mod: To choose the number and identity of your party members without spells, dialogues or using hotbar space.</w:t>
+      </w:r>
+    </w:p>
+    <w:p>
+      <w:r>
+        <w:rPr/>
         <w:t>Choose who is in your party from a menu. Open the Party tab in Mod Configuration Menu, tick the companions and hirelings you want with you, and press Apply. Raise the party limit to as many as 16. When the game can only handle four, at a long rest and on the Grymforge raft, Party Picker handles it for you: before a rest it asks which four to keep tonight and brings the others back when you wake, and on the raft it makes sure the whole party lands.</w:t>
       </w:r>
     </w:p>
@@ -1588,7 +1594,7 @@
       </w:r>
       <w:r>
         <w:rPr/>
-        <w:t xml:space="preserve"> (Party Limit Begone and similar). Both set the party limit, and whichever applies it last wins. Pick one.</w:t>
+        <w:t xml:space="preserve"> (Party Limit Begone and similar). Both set the party limit, and whichever applies it last wins. Pick one. Other Party Limit Mods: Could lead to odd results; use at your own risk.</w:t>
       </w:r>
     </w:p>
     <w:p>
@@ -1691,11 +1697,11 @@
         <w:rPr>
           <w:b/>
         </w:rPr>
-        <w:t>Quest items carried by members five and up are sometimes not registered by the game</w:t>
+        <w:t>Quest items carried by members five and up are sometimes not registered by the game.</w:t>
       </w:r>
       <w:r>
         <w:rPr/>
-        <w:t>, according to Party Limit Begone's notes. Party Picker does not address that. Keep quest items on your first four.</w:t>
+        <w:t xml:space="preserve"> This bug is according to Party Limit Begone's notes. Party Picker does not address that. Keep quest items on your first four.</w:t>
       </w:r>
     </w:p>
     <w:p>

</xml_diff>

<commit_message>
Party Picker 1.0.0 docs: drop the unverified quest-item limitation
Alan: "I don't want to flag a limit or bug if we are just guessing that it
might be there."
- Removed "Quest items carried by members five and up are sometimes not
  registered". It came from a search snippet of Party Limit Begone's page;
  the live page names no item, quest or cause, PixellBytes' Adjustable
  Party Limit (same SetMaxPartySizeOverride + PROC_CheckPartyFull calls)
  does not list it, and it was never seen in Party Picker's testing.
- Added a verified one: the House of Hope has four Debtor's Attire sets
  (Act3b_LOW_HouseOfHope2.txt L74-77, given out at L973-990), so members
  five and up get none.
- docs/RESEARCH.md and docs/DEVELOPMENT.md record the check.
</commit_message>
<xml_diff>
--- a/dist_docs/README.docx
+++ b/dist_docs/README.docx
@@ -1697,11 +1697,11 @@
         <w:rPr>
           <w:b/>
         </w:rPr>
-        <w:t>Quest items carried by members five and up are sometimes not registered by the game.</w:t>
+        <w:t>House of Hope (Act 3): only four party members get the Debtor's Attire.</w:t>
       </w:r>
       <w:r>
         <w:rPr/>
-        <w:t xml:space="preserve"> This bug is according to Party Limit Begone's notes. Party Picker does not address that. Keep quest items on your first four.</w:t>
+        <w:t xml:space="preserve"> The game has four sets and hands one to each party member in turn, so members five and up get none. Party Picker does not change this.</w:t>
       </w:r>
     </w:p>
     <w:p>

</xml_diff>